<commit_message>
Fix formatting and clarity issues in Cowork M365 Safety Guide documentation
</commit_message>
<xml_diff>
--- a/docs/Claude Intune App deployment.docx
+++ b/docs/Claude Intune App deployment.docx
@@ -359,7 +359,13 @@
     </w:p>
     <w:p>
       <w:r>
-        <w:t>No supersedence rules are needed for a fresh deployment. If you are replacing an earlier version of Claude Desktop that was packaged differently, add it here so Intune removes it before installing this version. Otherwise leave empty and click Next.</w:t>
+        <w:t>No supersedence rules are needed for a fresh deployment. If you are replacing an earlier version of Claude Desktop that was packaged differently, add it here so Intune removes it before installing this version. Otherwise</w:t>
+      </w:r>
+      <w:r>
+        <w:t xml:space="preserve">, leave it </w:t>
+      </w:r>
+      <w:r>
+        <w:t>empty and click Next.</w:t>
       </w:r>
     </w:p>
     <w:p>

</xml_diff>